<commit_message>
GUI adjustments, Filter Adjustment for Event List, Calendar Adjustments to get more data
</commit_message>
<xml_diff>
--- a/wwwroot/configsheets/AGB/AGBs.docx
+++ b/wwwroot/configsheets/AGB/AGBs.docx
@@ -38,28 +38,6 @@
       </w:pPr>
       <w:r>
         <w:t>Kannst du aus zwingenden Gründen (Unfall oder Krankheit) nicht teilnehmen, so melde dich umgehend telefonisch bei der verantwortlichen Person deines Kurses ab. Ansonsten ist die Teilnahme an den angemeldeten Kursen verbindlich und Ehrensache.</w:t>
-      </w:r>
-    </w:p>
-    <w:p>
-      <w:pPr>
-        <w:numPr>
-          <w:ilvl w:val="0"/>
-          <w:numId w:val="1"/>
-        </w:numPr>
-      </w:pPr>
-      <w:r>
-        <w:t>An </w:t>
-      </w:r>
-      <w:hyperlink r:id="rId5" w:history="1">
-        <w:r>
-          <w:rPr>
-            <w:rStyle w:val="Hyperlink"/>
-          </w:rPr>
-          <w:t>diese Personen</w:t>
-        </w:r>
-      </w:hyperlink>
-      <w:r>
-        <w:t> kannst du dich auch bei Fragen oder Unklarheiten wenden.</w:t>
       </w:r>
     </w:p>
     <w:p>
@@ -150,15 +128,7 @@
         </w:numPr>
       </w:pPr>
       <w:r>
-        <w:t xml:space="preserve">Die Kinder der Gemeinden Rohrbach, </w:t>
-      </w:r>
-      <w:proofErr w:type="spellStart"/>
-      <w:r>
-        <w:t>Auswil</w:t>
-      </w:r>
-      <w:proofErr w:type="spellEnd"/>
-      <w:r>
-        <w:t xml:space="preserve"> und Rohrbachgraben werden bei der Anmeldung bevorzugt. Kindern aus anderen Gemeinden ist die Teilnahme nur nach Rücksprache mit den Organisatoren gestattet.</w:t>
+        <w:t>Die Kinder der Gemeinden Rohrbach, Auswil und Rohrbachgraben werden bei der Anmeldung bevorzugt. Kindern aus anderen Gemeinden ist die Teilnahme nur nach Rücksprache mit den Organisatoren gestattet.</w:t>
       </w:r>
     </w:p>
     <w:p>
@@ -941,6 +911,7 @@
   <w:style w:type="character" w:default="1" w:styleId="Absatz-Standardschriftart">
     <w:name w:val="Default Paragraph Font"/>
     <w:uiPriority w:val="1"/>
+    <w:semiHidden/>
     <w:unhideWhenUsed/>
   </w:style>
   <w:style w:type="table" w:default="1" w:styleId="NormaleTabelle">

</xml_diff>

<commit_message>
adjusted Registration so when multiple children are registered at once the registration is handled correctly, adjusted bills for a correct refund registration
</commit_message>
<xml_diff>
--- a/wwwroot/configsheets/AGB/AGBs.docx
+++ b/wwwroot/configsheets/AGB/AGBs.docx
@@ -3,10 +3,18 @@
 <w:document xmlns:wpc="http://schemas.microsoft.com/office/word/2010/wordprocessingCanvas" xmlns:cx="http://schemas.microsoft.com/office/drawing/2014/chartex" xmlns:cx1="http://schemas.microsoft.com/office/drawing/2015/9/8/chartex" xmlns:cx2="http://schemas.microsoft.com/office/drawing/2015/10/21/chartex" xmlns:cx3="http://schemas.microsoft.com/office/drawing/2016/5/9/chartex" xmlns:cx4="http://schemas.microsoft.com/office/drawing/2016/5/10/chartex" xmlns:cx5="http://schemas.microsoft.com/office/drawing/2016/5/11/chartex" xmlns:cx6="http://schemas.microsoft.com/office/drawing/2016/5/12/chartex" xmlns:cx7="http://schemas.microsoft.com/office/drawing/2016/5/13/chartex" xmlns:cx8="http://schemas.microsoft.com/office/drawing/2016/5/14/chartex" xmlns:mc="http://schemas.openxmlformats.org/markup-compatibility/2006" xmlns:aink="http://schemas.microsoft.com/office/drawing/2016/ink" xmlns:am3d="http://schemas.microsoft.com/office/drawing/2017/model3d" xmlns:o="urn:schemas-microsoft-com:office:office" xmlns:oel="http://schemas.microsoft.com/office/2019/extlst" xmlns:r="http://schemas.openxmlformats.org/officeDocument/2006/relationships" xmlns:m="http://schemas.openxmlformats.org/officeDocument/2006/math" xmlns:v="urn:schemas-microsoft-com:vml" xmlns:wp14="http://schemas.microsoft.com/office/word/2010/wordprocessingDrawing" xmlns:wp="http://schemas.openxmlformats.org/drawingml/2006/wordprocessingDrawing" xmlns:w10="urn:schemas-microsoft-com:office:word" xmlns:w="http://schemas.openxmlformats.org/wordprocessingml/2006/main" xmlns:w14="http://schemas.microsoft.com/office/word/2010/wordml" xmlns:w15="http://schemas.microsoft.com/office/word/2012/wordml" xmlns:w16cex="http://schemas.microsoft.com/office/word/2018/wordml/cex" xmlns:w16cid="http://schemas.microsoft.com/office/word/2016/wordml/cid" xmlns:w16="http://schemas.microsoft.com/office/word/2018/wordml" xmlns:w16du="http://schemas.microsoft.com/office/word/2023/wordml/word16du" xmlns:w16sdtdh="http://schemas.microsoft.com/office/word/2020/wordml/sdtdatahash" xmlns:w16sdtfl="http://schemas.microsoft.com/office/word/2024/wordml/sdtformatlock" xmlns:w16se="http://schemas.microsoft.com/office/word/2015/wordml/symex" xmlns:wpg="http://schemas.microsoft.com/office/word/2010/wordprocessingGroup" xmlns:wpi="http://schemas.microsoft.com/office/word/2010/wordprocessingInk" xmlns:wne="http://schemas.microsoft.com/office/word/2006/wordml" xmlns:wps="http://schemas.microsoft.com/office/word/2010/wordprocessingShape" mc:Ignorable="w14 w15 w16se w16cid w16 w16cex w16sdtdh w16sdtfl w16du wp14">
   <w:body>
     <w:p>
+      <w:pPr>
+        <w:rPr>
+          <w:sz w:val="36"/>
+          <w:szCs w:val="36"/>
+        </w:rPr>
+      </w:pPr>
       <w:r>
         <w:rPr>
           <w:b/>
           <w:bCs/>
+          <w:sz w:val="36"/>
+          <w:szCs w:val="36"/>
         </w:rPr>
         <w:t>Bitte beachte folgende wichtige Punkte und zeige sie deinen Eltern:</w:t>
       </w:r>
@@ -17,17 +25,36 @@
           <w:ilvl w:val="0"/>
           <w:numId w:val="1"/>
         </w:numPr>
+        <w:rPr>
+          <w:sz w:val="36"/>
+          <w:szCs w:val="36"/>
+        </w:rPr>
       </w:pPr>
       <w:r>
         <w:rPr>
           <w:b/>
           <w:bCs/>
+          <w:sz w:val="36"/>
+          <w:szCs w:val="36"/>
         </w:rPr>
         <w:t>Die Anmeldung gilt als definitiv! </w:t>
       </w:r>
       <w:r>
+        <w:rPr>
+          <w:sz w:val="36"/>
+          <w:szCs w:val="36"/>
+        </w:rPr>
         <w:t>Bei zu wenig Teilnehmer werden die Kurse nicht durchgeführt (in diesem Fall würden wir nach dem Anmeldeschluss informieren)</w:t>
       </w:r>
+    </w:p>
+    <w:p>
+      <w:pPr>
+        <w:ind w:left="720"/>
+        <w:rPr>
+          <w:sz w:val="36"/>
+          <w:szCs w:val="36"/>
+        </w:rPr>
+      </w:pPr>
     </w:p>
     <w:p>
       <w:pPr>
@@ -35,10 +62,26 @@
           <w:ilvl w:val="0"/>
           <w:numId w:val="1"/>
         </w:numPr>
+        <w:rPr>
+          <w:sz w:val="36"/>
+          <w:szCs w:val="36"/>
+        </w:rPr>
       </w:pPr>
       <w:r>
+        <w:rPr>
+          <w:sz w:val="36"/>
+          <w:szCs w:val="36"/>
+        </w:rPr>
         <w:t>Kannst du aus zwingenden Gründen (Unfall oder Krankheit) nicht teilnehmen, so melde dich umgehend telefonisch bei der verantwortlichen Person deines Kurses ab. Ansonsten ist die Teilnahme an den angemeldeten Kursen verbindlich und Ehrensache.</w:t>
       </w:r>
+    </w:p>
+    <w:p>
+      <w:pPr>
+        <w:rPr>
+          <w:sz w:val="36"/>
+          <w:szCs w:val="36"/>
+        </w:rPr>
+      </w:pPr>
     </w:p>
     <w:p>
       <w:pPr>
@@ -46,10 +89,26 @@
           <w:ilvl w:val="0"/>
           <w:numId w:val="1"/>
         </w:numPr>
+        <w:rPr>
+          <w:sz w:val="36"/>
+          <w:szCs w:val="36"/>
+        </w:rPr>
       </w:pPr>
       <w:r>
+        <w:rPr>
+          <w:sz w:val="36"/>
+          <w:szCs w:val="36"/>
+        </w:rPr>
         <w:t>Trage deine Kurse in einem Kalender ein.</w:t>
       </w:r>
+    </w:p>
+    <w:p>
+      <w:pPr>
+        <w:rPr>
+          <w:sz w:val="36"/>
+          <w:szCs w:val="36"/>
+        </w:rPr>
+      </w:pPr>
     </w:p>
     <w:p>
       <w:pPr>
@@ -57,14 +116,28 @@
           <w:ilvl w:val="0"/>
           <w:numId w:val="1"/>
         </w:numPr>
+        <w:rPr>
+          <w:sz w:val="36"/>
+          <w:szCs w:val="36"/>
+        </w:rPr>
       </w:pPr>
       <w:r>
         <w:rPr>
           <w:b/>
           <w:bCs/>
+          <w:sz w:val="36"/>
+          <w:szCs w:val="36"/>
         </w:rPr>
         <w:t>Beachte den genauen Treffpunkt.</w:t>
       </w:r>
+    </w:p>
+    <w:p>
+      <w:pPr>
+        <w:rPr>
+          <w:sz w:val="36"/>
+          <w:szCs w:val="36"/>
+        </w:rPr>
+      </w:pPr>
     </w:p>
     <w:p>
       <w:pPr>
@@ -72,10 +145,26 @@
           <w:ilvl w:val="0"/>
           <w:numId w:val="1"/>
         </w:numPr>
+        <w:rPr>
+          <w:sz w:val="36"/>
+          <w:szCs w:val="36"/>
+        </w:rPr>
       </w:pPr>
       <w:r>
+        <w:rPr>
+          <w:sz w:val="36"/>
+          <w:szCs w:val="36"/>
+        </w:rPr>
         <w:t>Du bist nur während den Kurszeiten betreut.</w:t>
       </w:r>
+    </w:p>
+    <w:p>
+      <w:pPr>
+        <w:rPr>
+          <w:sz w:val="36"/>
+          <w:szCs w:val="36"/>
+        </w:rPr>
+      </w:pPr>
     </w:p>
     <w:p>
       <w:pPr>
@@ -83,10 +172,26 @@
           <w:ilvl w:val="0"/>
           <w:numId w:val="1"/>
         </w:numPr>
+        <w:rPr>
+          <w:sz w:val="36"/>
+          <w:szCs w:val="36"/>
+        </w:rPr>
       </w:pPr>
       <w:r>
+        <w:rPr>
+          <w:sz w:val="36"/>
+          <w:szCs w:val="36"/>
+        </w:rPr>
         <w:t>Die Versicherung ist Sache des Teilnehmers.</w:t>
       </w:r>
+    </w:p>
+    <w:p>
+      <w:pPr>
+        <w:rPr>
+          <w:sz w:val="36"/>
+          <w:szCs w:val="36"/>
+        </w:rPr>
+      </w:pPr>
     </w:p>
     <w:p>
       <w:pPr>
@@ -94,10 +199,26 @@
           <w:ilvl w:val="0"/>
           <w:numId w:val="1"/>
         </w:numPr>
+        <w:rPr>
+          <w:sz w:val="36"/>
+          <w:szCs w:val="36"/>
+        </w:rPr>
       </w:pPr>
       <w:r>
+        <w:rPr>
+          <w:sz w:val="36"/>
+          <w:szCs w:val="36"/>
+        </w:rPr>
         <w:t>Die Kleidung ist jeweils dem Kurs resp. Wetter anzupassen.</w:t>
       </w:r>
+    </w:p>
+    <w:p>
+      <w:pPr>
+        <w:rPr>
+          <w:sz w:val="36"/>
+          <w:szCs w:val="36"/>
+        </w:rPr>
+      </w:pPr>
     </w:p>
     <w:p>
       <w:pPr>
@@ -105,20 +226,43 @@
           <w:ilvl w:val="0"/>
           <w:numId w:val="1"/>
         </w:numPr>
+        <w:rPr>
+          <w:sz w:val="36"/>
+          <w:szCs w:val="36"/>
+        </w:rPr>
       </w:pPr>
       <w:r>
+        <w:rPr>
+          <w:sz w:val="36"/>
+          <w:szCs w:val="36"/>
+        </w:rPr>
+        <w:lastRenderedPageBreak/>
         <w:t>Bei Autofahrten, wenn nötig, </w:t>
       </w:r>
       <w:r>
         <w:rPr>
           <w:b/>
           <w:bCs/>
+          <w:sz w:val="36"/>
+          <w:szCs w:val="36"/>
         </w:rPr>
         <w:t>Sitzerhöhung </w:t>
       </w:r>
       <w:r>
+        <w:rPr>
+          <w:sz w:val="36"/>
+          <w:szCs w:val="36"/>
+        </w:rPr>
         <w:t>mitnehmen.</w:t>
       </w:r>
+    </w:p>
+    <w:p>
+      <w:pPr>
+        <w:rPr>
+          <w:sz w:val="36"/>
+          <w:szCs w:val="36"/>
+        </w:rPr>
+      </w:pPr>
     </w:p>
     <w:p>
       <w:pPr>
@@ -126,10 +270,42 @@
           <w:ilvl w:val="0"/>
           <w:numId w:val="1"/>
         </w:numPr>
+        <w:rPr>
+          <w:sz w:val="36"/>
+          <w:szCs w:val="36"/>
+        </w:rPr>
       </w:pPr>
       <w:r>
-        <w:t>Die Kinder der Gemeinden Rohrbach, Auswil und Rohrbachgraben werden bei der Anmeldung bevorzugt. Kindern aus anderen Gemeinden ist die Teilnahme nur nach Rücksprache mit den Organisatoren gestattet.</w:t>
+        <w:rPr>
+          <w:sz w:val="36"/>
+          <w:szCs w:val="36"/>
+        </w:rPr>
+        <w:t xml:space="preserve">Die Kinder der Gemeinden Rohrbach, </w:t>
       </w:r>
+      <w:proofErr w:type="spellStart"/>
+      <w:r>
+        <w:rPr>
+          <w:sz w:val="36"/>
+          <w:szCs w:val="36"/>
+        </w:rPr>
+        <w:t>Auswil</w:t>
+      </w:r>
+      <w:proofErr w:type="spellEnd"/>
+      <w:r>
+        <w:rPr>
+          <w:sz w:val="36"/>
+          <w:szCs w:val="36"/>
+        </w:rPr>
+        <w:t xml:space="preserve"> und Rohrbachgraben werden bei der Anmeldung bevorzugt. Kindern aus anderen Gemeinden ist die Teilnahme nur nach Rücksprache mit den Organisatoren gestattet.</w:t>
+      </w:r>
+    </w:p>
+    <w:p>
+      <w:pPr>
+        <w:rPr>
+          <w:sz w:val="36"/>
+          <w:szCs w:val="36"/>
+        </w:rPr>
+      </w:pPr>
     </w:p>
     <w:p>
       <w:pPr>
@@ -137,21 +313,52 @@
           <w:ilvl w:val="0"/>
           <w:numId w:val="1"/>
         </w:numPr>
+        <w:rPr>
+          <w:sz w:val="36"/>
+          <w:szCs w:val="36"/>
+        </w:rPr>
       </w:pPr>
       <w:r>
+        <w:rPr>
+          <w:sz w:val="36"/>
+          <w:szCs w:val="36"/>
+        </w:rPr>
         <w:t>Es ist möglich, dass Kurse fotografiert werden und die Bilder in der Zeitung veröffentlicht werden. Bei einer Anmeldung für einen Kurs stimmen Sie dem explizit zu.</w:t>
       </w:r>
     </w:p>
     <w:p>
+      <w:pPr>
+        <w:rPr>
+          <w:sz w:val="36"/>
+          <w:szCs w:val="36"/>
+        </w:rPr>
+      </w:pPr>
+    </w:p>
+    <w:p>
+      <w:pPr>
+        <w:rPr>
+          <w:sz w:val="36"/>
+          <w:szCs w:val="36"/>
+        </w:rPr>
+      </w:pPr>
       <w:r>
         <w:rPr>
           <w:b/>
           <w:bCs/>
+          <w:sz w:val="36"/>
+          <w:szCs w:val="36"/>
         </w:rPr>
         <w:t>Bezahlung: Bitte die Bezahlung im Voraus überweisen, Danke</w:t>
       </w:r>
     </w:p>
-    <w:p/>
+    <w:p>
+      <w:pPr>
+        <w:rPr>
+          <w:sz w:val="36"/>
+          <w:szCs w:val="36"/>
+        </w:rPr>
+      </w:pPr>
+    </w:p>
     <w:sectPr>
       <w:pgSz w:w="11906" w:h="16838"/>
       <w:pgMar w:top="1417" w:right="1417" w:bottom="1134" w:left="1417" w:header="708" w:footer="708" w:gutter="0"/>

</xml_diff>